<commit_message>
Replace downloadable CV document
</commit_message>
<xml_diff>
--- a/public/Mark_OHare_CV_2026_V1.docx
+++ b/public/Mark_OHare_CV_2026_V1.docx
@@ -37,8 +37,37 @@
         </w:pBdr>
       </w:pPr>
       <w:r>
-        <w:t>m.ohare@hotmail.co.uk | 07861 701490 | North Lanarkshire / Scotland | LinkedIn: / Digital CV</w:t>
+        <w:t xml:space="preserve">m.ohare@hotmail.co.uk | </w:t>
       </w:r>
+      <w:r>
+        <w:rPr>
+          <w:b/>
+          <w:bCs/>
+        </w:rPr>
+        <w:t>07861 701490</w:t>
+      </w:r>
+      <w:r>
+        <w:t xml:space="preserve"> | North Lanarkshire / Scotland | </w:t>
+      </w:r>
+      <w:hyperlink r:id="rId6" w:history="1">
+        <w:r>
+          <w:rPr>
+            <w:rStyle w:val="Hyperlink"/>
+          </w:rPr>
+          <w:t>LinkedIn:</w:t>
+        </w:r>
+      </w:hyperlink>
+      <w:r>
+        <w:t xml:space="preserve"> / </w:t>
+      </w:r>
+      <w:hyperlink r:id="rId7" w:history="1">
+        <w:r>
+          <w:rPr>
+            <w:rStyle w:val="Hyperlink"/>
+          </w:rPr>
+          <w:t>Digital CV</w:t>
+        </w:r>
+      </w:hyperlink>
     </w:p>
     <w:p>
       <w:pPr>
@@ -12610,6 +12639,29 @@
       <w:sz w:val="17"/>
     </w:rPr>
   </w:style>
+  <w:style w:type="character" w:styleId="Hyperlink">
+    <w:name w:val="Hyperlink"/>
+    <w:basedOn w:val="DefaultParagraphFont"/>
+    <w:uiPriority w:val="99"/>
+    <w:unhideWhenUsed/>
+    <w:rsid w:val="00741B70"/>
+    <w:rPr>
+      <w:color w:val="0000FF" w:themeColor="hyperlink"/>
+      <w:u w:val="single"/>
+    </w:rPr>
+  </w:style>
+  <w:style w:type="character" w:styleId="UnresolvedMention">
+    <w:name w:val="Unresolved Mention"/>
+    <w:basedOn w:val="DefaultParagraphFont"/>
+    <w:uiPriority w:val="99"/>
+    <w:semiHidden/>
+    <w:unhideWhenUsed/>
+    <w:rsid w:val="00741B70"/>
+    <w:rPr>
+      <w:color w:val="605E5C"/>
+      <w:shd w:val="clear" w:color="auto" w:fill="E1DFDD"/>
+    </w:rPr>
+  </w:style>
 </w:styles>
 </file>
 

</xml_diff>